<commit_message>
Final document set for submission to TASCO Insurance
All 38 documents, the proposal and the cover letter reviewed against the code
and rebuilt on the iorta TechNXT template (dated 08/10/2026): data-request
register (FR-118) and quick renewal (FR-119) documented across requirements,
architecture, UX, manuals, tests, operations and the proposal; TASCO Insurance
brand alone; figures current (103 routes, 271 tests, coverage above 99%);
unconfirmed claims removed. Test workbook regenerated: 206 cases, 178 Pass,
24 Not Run, 4 Blocked.

Co-Authored-By: Claude Opus 5.5 <noreply@anthropic.com>
Claude-Session: https://claude.ai/code/session_01JKboFEjK8WnRLrewyCKcAM
</commit_message>
<xml_diff>
--- a/docs/TGP-00 Document Register.docx
+++ b/docs/TGP-00 Document Register.docx
@@ -401,7 +401,7 @@
                                 <w:bCs/>
                                 <w:color w:val="1D74BA"/>
                               </w:rPr>
-                              <w:t xml:space="preserve">07 October 2026</w:t>
+                              <w:t xml:space="preserve">08 October 2026</w:t>
                             </w:r>
                           </w:p>
                         </w:txbxContent>
@@ -2114,7 +2114,7 @@
                 <w:sz w:val="16"/>
                 <w:szCs w:val="16"/>
               </w:rPr>
-              <w:t xml:space="preserve">07/10/2026</w:t>
+              <w:t xml:space="preserve">08/10/2026</w:t>
             </w:r>
           </w:p>
         </w:tc>
@@ -2360,8 +2360,8 @@
         <w:tblLook w:val="04A0" w:firstRow="1" w:lastRow="0" w:firstColumn="0" w:lastColumn="0" w:noHBand="0" w:noVBand="1"/>
       </w:tblPr>
       <w:tblGrid>
-        <w:gridCol w:w="1786"/>
-        <w:gridCol w:w="7241"/>
+        <w:gridCol w:w="1813"/>
+        <w:gridCol w:w="7214"/>
       </w:tblGrid>
       <w:tr>
         <w:trPr>
@@ -2371,7 +2371,7 @@
         </w:trPr>
         <w:tc>
           <w:tcPr>
-            <w:tcW w:w="1786" w:type="dxa"/>
+            <w:tcW w:w="1813" w:type="dxa"/>
             <w:shd w:val="clear" w:color="auto" w:fill="0F4761"/>
             <w:vAlign w:val="center"/>
           </w:tcPr>
@@ -2402,7 +2402,7 @@
         </w:tc>
         <w:tc>
           <w:tcPr>
-            <w:tcW w:w="7241" w:type="dxa"/>
+            <w:tcW w:w="7214" w:type="dxa"/>
             <w:shd w:val="clear" w:color="auto" w:fill="0F4761"/>
             <w:vAlign w:val="center"/>
           </w:tcPr>
@@ -2439,7 +2439,7 @@
         </w:trPr>
         <w:tc>
           <w:tcPr>
-            <w:tcW w:w="1786" w:type="dxa"/>
+            <w:tcW w:w="1813" w:type="dxa"/>
             <w:vAlign w:val="top"/>
           </w:tcPr>
           <w:p>
@@ -2465,7 +2465,7 @@
         </w:tc>
         <w:tc>
           <w:tcPr>
-            <w:tcW w:w="7241" w:type="dxa"/>
+            <w:tcW w:w="7214" w:type="dxa"/>
             <w:vAlign w:val="top"/>
           </w:tcPr>
           <w:p>
@@ -2497,7 +2497,7 @@
         </w:trPr>
         <w:tc>
           <w:tcPr>
-            <w:tcW w:w="1786" w:type="dxa"/>
+            <w:tcW w:w="1813" w:type="dxa"/>
             <w:vAlign w:val="top"/>
           </w:tcPr>
           <w:p>
@@ -2523,7 +2523,7 @@
         </w:tc>
         <w:tc>
           <w:tcPr>
-            <w:tcW w:w="7241" w:type="dxa"/>
+            <w:tcW w:w="7214" w:type="dxa"/>
             <w:vAlign w:val="top"/>
           </w:tcPr>
           <w:p>
@@ -2555,7 +2555,7 @@
         </w:trPr>
         <w:tc>
           <w:tcPr>
-            <w:tcW w:w="1786" w:type="dxa"/>
+            <w:tcW w:w="1813" w:type="dxa"/>
             <w:vAlign w:val="top"/>
           </w:tcPr>
           <w:p>
@@ -2575,13 +2575,13 @@
                 <w:sz w:val="16"/>
                 <w:szCs w:val="16"/>
               </w:rPr>
-              <w:t xml:space="preserve">IT</w:t>
-            </w:r>
-          </w:p>
-        </w:tc>
-        <w:tc>
-          <w:tcPr>
-            <w:tcW w:w="7241" w:type="dxa"/>
+              <w:t xml:space="preserve">ID</w:t>
+            </w:r>
+          </w:p>
+        </w:tc>
+        <w:tc>
+          <w:tcPr>
+            <w:tcW w:w="7214" w:type="dxa"/>
             <w:vAlign w:val="top"/>
           </w:tcPr>
           <w:p>
@@ -2601,7 +2601,7 @@
                 <w:sz w:val="16"/>
                 <w:szCs w:val="16"/>
               </w:rPr>
-              <w:t xml:space="preserve">Information Technology</w:t>
+              <w:t xml:space="preserve">Identifier</w:t>
             </w:r>
           </w:p>
         </w:tc>
@@ -2613,7 +2613,7 @@
         </w:trPr>
         <w:tc>
           <w:tcPr>
-            <w:tcW w:w="1786" w:type="dxa"/>
+            <w:tcW w:w="1813" w:type="dxa"/>
             <w:vAlign w:val="top"/>
           </w:tcPr>
           <w:p>
@@ -2633,13 +2633,13 @@
                 <w:sz w:val="16"/>
                 <w:szCs w:val="16"/>
               </w:rPr>
-              <w:t xml:space="preserve">MVP</w:t>
-            </w:r>
-          </w:p>
-        </w:tc>
-        <w:tc>
-          <w:tcPr>
-            <w:tcW w:w="7241" w:type="dxa"/>
+              <w:t xml:space="preserve">IT</w:t>
+            </w:r>
+          </w:p>
+        </w:tc>
+        <w:tc>
+          <w:tcPr>
+            <w:tcW w:w="7214" w:type="dxa"/>
             <w:vAlign w:val="top"/>
           </w:tcPr>
           <w:p>
@@ -2659,7 +2659,7 @@
                 <w:sz w:val="16"/>
                 <w:szCs w:val="16"/>
               </w:rPr>
-              <w:t xml:space="preserve">Minimum Viable Product</w:t>
+              <w:t xml:space="preserve">Information Technology</w:t>
             </w:r>
           </w:p>
         </w:tc>
@@ -2671,7 +2671,7 @@
         </w:trPr>
         <w:tc>
           <w:tcPr>
-            <w:tcW w:w="1786" w:type="dxa"/>
+            <w:tcW w:w="1813" w:type="dxa"/>
             <w:vAlign w:val="top"/>
           </w:tcPr>
           <w:p>
@@ -2691,13 +2691,13 @@
                 <w:sz w:val="16"/>
                 <w:szCs w:val="16"/>
               </w:rPr>
-              <w:t xml:space="preserve">QA</w:t>
-            </w:r>
-          </w:p>
-        </w:tc>
-        <w:tc>
-          <w:tcPr>
-            <w:tcW w:w="7241" w:type="dxa"/>
+              <w:t xml:space="preserve">MVP</w:t>
+            </w:r>
+          </w:p>
+        </w:tc>
+        <w:tc>
+          <w:tcPr>
+            <w:tcW w:w="7214" w:type="dxa"/>
             <w:vAlign w:val="top"/>
           </w:tcPr>
           <w:p>
@@ -2717,7 +2717,7 @@
                 <w:sz w:val="16"/>
                 <w:szCs w:val="16"/>
               </w:rPr>
-              <w:t xml:space="preserve">Quality Assurance</w:t>
+              <w:t xml:space="preserve">Minimum Viable Product</w:t>
             </w:r>
           </w:p>
         </w:tc>
@@ -2729,7 +2729,7 @@
         </w:trPr>
         <w:tc>
           <w:tcPr>
-            <w:tcW w:w="1786" w:type="dxa"/>
+            <w:tcW w:w="1813" w:type="dxa"/>
             <w:vAlign w:val="top"/>
           </w:tcPr>
           <w:p>
@@ -2749,13 +2749,13 @@
                 <w:sz w:val="16"/>
                 <w:szCs w:val="16"/>
               </w:rPr>
-              <w:t xml:space="preserve">RACI</w:t>
-            </w:r>
-          </w:p>
-        </w:tc>
-        <w:tc>
-          <w:tcPr>
-            <w:tcW w:w="7241" w:type="dxa"/>
+              <w:t xml:space="preserve">QA</w:t>
+            </w:r>
+          </w:p>
+        </w:tc>
+        <w:tc>
+          <w:tcPr>
+            <w:tcW w:w="7214" w:type="dxa"/>
             <w:vAlign w:val="top"/>
           </w:tcPr>
           <w:p>
@@ -2775,7 +2775,7 @@
                 <w:sz w:val="16"/>
                 <w:szCs w:val="16"/>
               </w:rPr>
-              <w:t xml:space="preserve">Responsible, Accountable, Consulted, Informed</w:t>
+              <w:t xml:space="preserve">Quality Assurance</w:t>
             </w:r>
           </w:p>
         </w:tc>
@@ -2787,7 +2787,7 @@
         </w:trPr>
         <w:tc>
           <w:tcPr>
-            <w:tcW w:w="1786" w:type="dxa"/>
+            <w:tcW w:w="1813" w:type="dxa"/>
             <w:vAlign w:val="top"/>
           </w:tcPr>
           <w:p>
@@ -2807,13 +2807,13 @@
                 <w:sz w:val="16"/>
                 <w:szCs w:val="16"/>
               </w:rPr>
-              <w:t xml:space="preserve">SME</w:t>
-            </w:r>
-          </w:p>
-        </w:tc>
-        <w:tc>
-          <w:tcPr>
-            <w:tcW w:w="7241" w:type="dxa"/>
+              <w:t xml:space="preserve">RACI</w:t>
+            </w:r>
+          </w:p>
+        </w:tc>
+        <w:tc>
+          <w:tcPr>
+            <w:tcW w:w="7214" w:type="dxa"/>
             <w:vAlign w:val="top"/>
           </w:tcPr>
           <w:p>
@@ -2833,7 +2833,7 @@
                 <w:sz w:val="16"/>
                 <w:szCs w:val="16"/>
               </w:rPr>
-              <w:t xml:space="preserve">Subject-Matter Expert</w:t>
+              <w:t xml:space="preserve">Responsible, Accountable, Consulted, Informed</w:t>
             </w:r>
           </w:p>
         </w:tc>
@@ -2845,7 +2845,7 @@
         </w:trPr>
         <w:tc>
           <w:tcPr>
-            <w:tcW w:w="1786" w:type="dxa"/>
+            <w:tcW w:w="1813" w:type="dxa"/>
             <w:vAlign w:val="top"/>
           </w:tcPr>
           <w:p>
@@ -2865,13 +2865,13 @@
                 <w:sz w:val="16"/>
                 <w:szCs w:val="16"/>
               </w:rPr>
-              <w:t xml:space="preserve">TGP</w:t>
-            </w:r>
-          </w:p>
-        </w:tc>
-        <w:tc>
-          <w:tcPr>
-            <w:tcW w:w="7241" w:type="dxa"/>
+              <w:t xml:space="preserve">SME</w:t>
+            </w:r>
+          </w:p>
+        </w:tc>
+        <w:tc>
+          <w:tcPr>
+            <w:tcW w:w="7214" w:type="dxa"/>
             <w:vAlign w:val="top"/>
           </w:tcPr>
           <w:p>
@@ -2891,7 +2891,7 @@
                 <w:sz w:val="16"/>
                 <w:szCs w:val="16"/>
               </w:rPr>
-              <w:t xml:space="preserve">TASCO Growth Platform (document identifier prefix)</w:t>
+              <w:t xml:space="preserve">Subject-Matter Expert</w:t>
             </w:r>
           </w:p>
         </w:tc>
@@ -2903,7 +2903,7 @@
         </w:trPr>
         <w:tc>
           <w:tcPr>
-            <w:tcW w:w="1786" w:type="dxa"/>
+            <w:tcW w:w="1813" w:type="dxa"/>
             <w:vAlign w:val="top"/>
           </w:tcPr>
           <w:p>
@@ -2923,13 +2923,13 @@
                 <w:sz w:val="16"/>
                 <w:szCs w:val="16"/>
               </w:rPr>
-              <w:t xml:space="preserve">UAT</w:t>
-            </w:r>
-          </w:p>
-        </w:tc>
-        <w:tc>
-          <w:tcPr>
-            <w:tcW w:w="7241" w:type="dxa"/>
+              <w:t xml:space="preserve">TGP</w:t>
+            </w:r>
+          </w:p>
+        </w:tc>
+        <w:tc>
+          <w:tcPr>
+            <w:tcW w:w="7214" w:type="dxa"/>
             <w:vAlign w:val="top"/>
           </w:tcPr>
           <w:p>
@@ -2949,7 +2949,7 @@
                 <w:sz w:val="16"/>
                 <w:szCs w:val="16"/>
               </w:rPr>
-              <w:t xml:space="preserve">User Acceptance Testing</w:t>
+              <w:t xml:space="preserve">TASCO Growth Platform (document identifier prefix)</w:t>
             </w:r>
           </w:p>
         </w:tc>
@@ -2961,7 +2961,7 @@
         </w:trPr>
         <w:tc>
           <w:tcPr>
-            <w:tcW w:w="1786" w:type="dxa"/>
+            <w:tcW w:w="1813" w:type="dxa"/>
             <w:vAlign w:val="top"/>
           </w:tcPr>
           <w:p>
@@ -2981,13 +2981,13 @@
                 <w:sz w:val="16"/>
                 <w:szCs w:val="16"/>
               </w:rPr>
-              <w:t xml:space="preserve">UX</w:t>
-            </w:r>
-          </w:p>
-        </w:tc>
-        <w:tc>
-          <w:tcPr>
-            <w:tcW w:w="7241" w:type="dxa"/>
+              <w:t xml:space="preserve">UAT</w:t>
+            </w:r>
+          </w:p>
+        </w:tc>
+        <w:tc>
+          <w:tcPr>
+            <w:tcW w:w="7214" w:type="dxa"/>
             <w:vAlign w:val="top"/>
           </w:tcPr>
           <w:p>
@@ -3007,7 +3007,7 @@
                 <w:sz w:val="16"/>
                 <w:szCs w:val="16"/>
               </w:rPr>
-              <w:t xml:space="preserve">User Experience</w:t>
+              <w:t xml:space="preserve">User Acceptance Testing</w:t>
             </w:r>
           </w:p>
         </w:tc>
@@ -3019,7 +3019,7 @@
         </w:trPr>
         <w:tc>
           <w:tcPr>
-            <w:tcW w:w="1786" w:type="dxa"/>
+            <w:tcW w:w="1813" w:type="dxa"/>
             <w:vAlign w:val="top"/>
           </w:tcPr>
           <w:p>
@@ -3039,13 +3039,13 @@
                 <w:sz w:val="16"/>
                 <w:szCs w:val="16"/>
               </w:rPr>
-              <w:t xml:space="preserve">VETC</w:t>
-            </w:r>
-          </w:p>
-        </w:tc>
-        <w:tc>
-          <w:tcPr>
-            <w:tcW w:w="7241" w:type="dxa"/>
+              <w:t xml:space="preserve">UX</w:t>
+            </w:r>
+          </w:p>
+        </w:tc>
+        <w:tc>
+          <w:tcPr>
+            <w:tcW w:w="7214" w:type="dxa"/>
             <w:vAlign w:val="top"/>
           </w:tcPr>
           <w:p>
@@ -3065,7 +3065,7 @@
                 <w:sz w:val="16"/>
                 <w:szCs w:val="16"/>
               </w:rPr>
-              <w:t xml:space="preserve">VETC Automatic Toll Collection Company</w:t>
+              <w:t xml:space="preserve">User Experience</w:t>
             </w:r>
           </w:p>
         </w:tc>
@@ -3077,7 +3077,7 @@
         </w:trPr>
         <w:tc>
           <w:tcPr>
-            <w:tcW w:w="1786" w:type="dxa"/>
+            <w:tcW w:w="1813" w:type="dxa"/>
             <w:vAlign w:val="top"/>
           </w:tcPr>
           <w:p>
@@ -3097,13 +3097,71 @@
                 <w:sz w:val="16"/>
                 <w:szCs w:val="16"/>
               </w:rPr>
+              <w:t xml:space="preserve">VETC</w:t>
+            </w:r>
+          </w:p>
+        </w:tc>
+        <w:tc>
+          <w:tcPr>
+            <w:tcW w:w="7214" w:type="dxa"/>
+            <w:vAlign w:val="top"/>
+          </w:tcPr>
+          <w:p>
+            <w:pPr>
+              <w:spacing w:before="60"/>
+              <w:rPr>
+                <w:rFonts w:ascii="Segoe UI" w:eastAsia="Arial" w:hAnsi="Segoe UI" w:cs="Segoe UI"/>
+                <w:color w:val="101820"/>
+                <w:sz w:val="16"/>
+                <w:szCs w:val="16"/>
+              </w:rPr>
+            </w:pPr>
+            <w:r>
+              <w:rPr>
+                <w:rFonts w:ascii="Segoe UI" w:eastAsia="Arial" w:hAnsi="Segoe UI" w:cs="Segoe UI"/>
+                <w:color w:val="101820"/>
+                <w:sz w:val="16"/>
+                <w:szCs w:val="16"/>
+              </w:rPr>
+              <w:t xml:space="preserve">VETC Automatic Toll Collection Company</w:t>
+            </w:r>
+          </w:p>
+        </w:tc>
+      </w:tr>
+      <w:tr>
+        <w:trPr>
+          <w:cantSplit/>
+          <w:trHeight w:val="449"/>
+        </w:trPr>
+        <w:tc>
+          <w:tcPr>
+            <w:tcW w:w="1813" w:type="dxa"/>
+            <w:vAlign w:val="top"/>
+          </w:tcPr>
+          <w:p>
+            <w:pPr>
+              <w:spacing w:before="60"/>
+              <w:rPr>
+                <w:rFonts w:ascii="Segoe UI" w:eastAsia="Arial" w:hAnsi="Segoe UI" w:cs="Segoe UI"/>
+                <w:color w:val="101820"/>
+                <w:sz w:val="16"/>
+                <w:szCs w:val="16"/>
+              </w:rPr>
+            </w:pPr>
+            <w:r>
+              <w:rPr>
+                <w:rFonts w:ascii="Segoe UI" w:eastAsia="Arial" w:hAnsi="Segoe UI" w:cs="Segoe UI"/>
+                <w:color w:val="101820"/>
+                <w:sz w:val="16"/>
+                <w:szCs w:val="16"/>
+              </w:rPr>
               <w:t xml:space="preserve">WCAG</w:t>
             </w:r>
           </w:p>
         </w:tc>
         <w:tc>
           <w:tcPr>
-            <w:tcW w:w="7241" w:type="dxa"/>
+            <w:tcW w:w="7214" w:type="dxa"/>
             <w:vAlign w:val="top"/>
           </w:tcPr>
           <w:p>
@@ -3879,7 +3937,7 @@
         <w:pStyle w:val="FirstParagraph"/>
       </w:pPr>
       <w:r>
-        <w:t xml:space="preserve">All documents in this set are issued as version 1.0, dated 07/10/2026, for submission. After contract signature:</w:t>
+        <w:t xml:space="preserve">All documents in this set are issued as version 1.0, dated 08/10/2026, for submission. After contract signature:</w:t>
       </w:r>
     </w:p>
     <w:p>
@@ -4286,9 +4344,9 @@
       <w:tblGrid>
         <w:gridCol w:w="1421"/>
         <w:gridCol w:w="1926"/>
-        <w:gridCol w:w="2083"/>
+        <w:gridCol w:w="2084"/>
         <w:gridCol w:w="1916"/>
-        <w:gridCol w:w="1681"/>
+        <w:gridCol w:w="1680"/>
       </w:tblGrid>
       <w:tr>
         <w:trPr>
@@ -4335,7 +4393,7 @@
         </w:tc>
         <w:tc>
           <w:tcPr>
-            <w:tcW w:w="2083" w:type="dxa"/>
+            <w:tcW w:w="2084" w:type="dxa"/>
             <w:shd w:val="clear" w:color="auto" w:fill="0F4761"/>
             <w:vAlign w:val="center"/>
           </w:tcPr>
@@ -4373,7 +4431,7 @@
         </w:tc>
         <w:tc>
           <w:tcPr>
-            <w:tcW w:w="1681" w:type="dxa"/>
+            <w:tcW w:w="1680" w:type="dxa"/>
             <w:shd w:val="clear" w:color="auto" w:fill="0F4761"/>
             <w:vAlign w:val="center"/>
           </w:tcPr>
@@ -4428,7 +4486,7 @@
         </w:tc>
         <w:tc>
           <w:tcPr>
-            <w:tcW w:w="2083" w:type="dxa"/>
+            <w:tcW w:w="2084" w:type="dxa"/>
             <w:vAlign w:val="top"/>
           </w:tcPr>
           <w:p>
@@ -4458,7 +4516,7 @@
         </w:tc>
         <w:tc>
           <w:tcPr>
-            <w:tcW w:w="1681" w:type="dxa"/>
+            <w:tcW w:w="1680" w:type="dxa"/>
             <w:vAlign w:val="top"/>
           </w:tcPr>
           <w:p>
@@ -4508,9 +4566,9 @@
       <w:tblGrid>
         <w:gridCol w:w="1421"/>
         <w:gridCol w:w="1926"/>
-        <w:gridCol w:w="2083"/>
+        <w:gridCol w:w="2084"/>
         <w:gridCol w:w="1916"/>
-        <w:gridCol w:w="1681"/>
+        <w:gridCol w:w="1680"/>
       </w:tblGrid>
       <w:tr>
         <w:trPr>
@@ -4557,7 +4615,7 @@
         </w:tc>
         <w:tc>
           <w:tcPr>
-            <w:tcW w:w="2083" w:type="dxa"/>
+            <w:tcW w:w="2084" w:type="dxa"/>
             <w:shd w:val="clear" w:color="auto" w:fill="0F4761"/>
             <w:vAlign w:val="center"/>
           </w:tcPr>
@@ -4595,7 +4653,7 @@
         </w:tc>
         <w:tc>
           <w:tcPr>
-            <w:tcW w:w="1681" w:type="dxa"/>
+            <w:tcW w:w="1680" w:type="dxa"/>
             <w:shd w:val="clear" w:color="auto" w:fill="0F4761"/>
             <w:vAlign w:val="center"/>
           </w:tcPr>
@@ -4650,7 +4708,7 @@
         </w:tc>
         <w:tc>
           <w:tcPr>
-            <w:tcW w:w="2083" w:type="dxa"/>
+            <w:tcW w:w="2084" w:type="dxa"/>
             <w:vAlign w:val="top"/>
           </w:tcPr>
           <w:p>
@@ -4680,7 +4738,7 @@
         </w:tc>
         <w:tc>
           <w:tcPr>
-            <w:tcW w:w="1681" w:type="dxa"/>
+            <w:tcW w:w="1680" w:type="dxa"/>
             <w:vAlign w:val="top"/>
           </w:tcPr>
           <w:p>
@@ -4733,7 +4791,7 @@
         </w:tc>
         <w:tc>
           <w:tcPr>
-            <w:tcW w:w="2083" w:type="dxa"/>
+            <w:tcW w:w="2084" w:type="dxa"/>
             <w:shd w:val="clear" w:color="auto" w:fill="F4F7FB"/>
             <w:vAlign w:val="top"/>
           </w:tcPr>
@@ -4765,7 +4823,7 @@
         </w:tc>
         <w:tc>
           <w:tcPr>
-            <w:tcW w:w="1681" w:type="dxa"/>
+            <w:tcW w:w="1680" w:type="dxa"/>
             <w:shd w:val="clear" w:color="auto" w:fill="F4F7FB"/>
             <w:vAlign w:val="top"/>
           </w:tcPr>
@@ -4817,7 +4875,7 @@
         </w:tc>
         <w:tc>
           <w:tcPr>
-            <w:tcW w:w="2083" w:type="dxa"/>
+            <w:tcW w:w="2084" w:type="dxa"/>
             <w:vAlign w:val="top"/>
           </w:tcPr>
           <w:p>
@@ -4847,7 +4905,7 @@
         </w:tc>
         <w:tc>
           <w:tcPr>
-            <w:tcW w:w="1681" w:type="dxa"/>
+            <w:tcW w:w="1680" w:type="dxa"/>
             <w:vAlign w:val="top"/>
           </w:tcPr>
           <w:p>
@@ -4900,7 +4958,7 @@
         </w:tc>
         <w:tc>
           <w:tcPr>
-            <w:tcW w:w="2083" w:type="dxa"/>
+            <w:tcW w:w="2084" w:type="dxa"/>
             <w:shd w:val="clear" w:color="auto" w:fill="F4F7FB"/>
             <w:vAlign w:val="top"/>
           </w:tcPr>
@@ -4932,7 +4990,7 @@
         </w:tc>
         <w:tc>
           <w:tcPr>
-            <w:tcW w:w="1681" w:type="dxa"/>
+            <w:tcW w:w="1680" w:type="dxa"/>
             <w:shd w:val="clear" w:color="auto" w:fill="F4F7FB"/>
             <w:vAlign w:val="top"/>
           </w:tcPr>
@@ -4984,7 +5042,7 @@
         </w:tc>
         <w:tc>
           <w:tcPr>
-            <w:tcW w:w="2083" w:type="dxa"/>
+            <w:tcW w:w="2084" w:type="dxa"/>
             <w:vAlign w:val="top"/>
           </w:tcPr>
           <w:p>
@@ -5014,7 +5072,7 @@
         </w:tc>
         <w:tc>
           <w:tcPr>
-            <w:tcW w:w="1681" w:type="dxa"/>
+            <w:tcW w:w="1680" w:type="dxa"/>
             <w:vAlign w:val="top"/>
           </w:tcPr>
           <w:p>
@@ -5067,7 +5125,7 @@
         </w:tc>
         <w:tc>
           <w:tcPr>
-            <w:tcW w:w="2083" w:type="dxa"/>
+            <w:tcW w:w="2084" w:type="dxa"/>
             <w:shd w:val="clear" w:color="auto" w:fill="F4F7FB"/>
             <w:vAlign w:val="top"/>
           </w:tcPr>
@@ -5099,7 +5157,7 @@
         </w:tc>
         <w:tc>
           <w:tcPr>
-            <w:tcW w:w="1681" w:type="dxa"/>
+            <w:tcW w:w="1680" w:type="dxa"/>
             <w:shd w:val="clear" w:color="auto" w:fill="F4F7FB"/>
             <w:vAlign w:val="top"/>
           </w:tcPr>
@@ -5151,7 +5209,7 @@
         </w:tc>
         <w:tc>
           <w:tcPr>
-            <w:tcW w:w="2083" w:type="dxa"/>
+            <w:tcW w:w="2084" w:type="dxa"/>
             <w:vAlign w:val="top"/>
           </w:tcPr>
           <w:p>
@@ -5181,7 +5239,7 @@
         </w:tc>
         <w:tc>
           <w:tcPr>
-            <w:tcW w:w="1681" w:type="dxa"/>
+            <w:tcW w:w="1680" w:type="dxa"/>
             <w:vAlign w:val="top"/>
           </w:tcPr>
           <w:p>
@@ -5231,9 +5289,9 @@
       <w:tblGrid>
         <w:gridCol w:w="1421"/>
         <w:gridCol w:w="1926"/>
-        <w:gridCol w:w="2083"/>
+        <w:gridCol w:w="2084"/>
         <w:gridCol w:w="1916"/>
-        <w:gridCol w:w="1681"/>
+        <w:gridCol w:w="1680"/>
       </w:tblGrid>
       <w:tr>
         <w:trPr>
@@ -5280,7 +5338,7 @@
         </w:tc>
         <w:tc>
           <w:tcPr>
-            <w:tcW w:w="2083" w:type="dxa"/>
+            <w:tcW w:w="2084" w:type="dxa"/>
             <w:shd w:val="clear" w:color="auto" w:fill="0F4761"/>
             <w:vAlign w:val="center"/>
           </w:tcPr>
@@ -5318,7 +5376,7 @@
         </w:tc>
         <w:tc>
           <w:tcPr>
-            <w:tcW w:w="1681" w:type="dxa"/>
+            <w:tcW w:w="1680" w:type="dxa"/>
             <w:shd w:val="clear" w:color="auto" w:fill="0F4761"/>
             <w:vAlign w:val="center"/>
           </w:tcPr>
@@ -5373,7 +5431,7 @@
         </w:tc>
         <w:tc>
           <w:tcPr>
-            <w:tcW w:w="2083" w:type="dxa"/>
+            <w:tcW w:w="2084" w:type="dxa"/>
             <w:vAlign w:val="top"/>
           </w:tcPr>
           <w:p>
@@ -5403,7 +5461,7 @@
         </w:tc>
         <w:tc>
           <w:tcPr>
-            <w:tcW w:w="1681" w:type="dxa"/>
+            <w:tcW w:w="1680" w:type="dxa"/>
             <w:vAlign w:val="top"/>
           </w:tcPr>
           <w:p>
@@ -5456,7 +5514,7 @@
         </w:tc>
         <w:tc>
           <w:tcPr>
-            <w:tcW w:w="2083" w:type="dxa"/>
+            <w:tcW w:w="2084" w:type="dxa"/>
             <w:shd w:val="clear" w:color="auto" w:fill="F4F7FB"/>
             <w:vAlign w:val="top"/>
           </w:tcPr>
@@ -5488,7 +5546,7 @@
         </w:tc>
         <w:tc>
           <w:tcPr>
-            <w:tcW w:w="1681" w:type="dxa"/>
+            <w:tcW w:w="1680" w:type="dxa"/>
             <w:shd w:val="clear" w:color="auto" w:fill="F4F7FB"/>
             <w:vAlign w:val="top"/>
           </w:tcPr>
@@ -5540,7 +5598,7 @@
         </w:tc>
         <w:tc>
           <w:tcPr>
-            <w:tcW w:w="2083" w:type="dxa"/>
+            <w:tcW w:w="2084" w:type="dxa"/>
             <w:vAlign w:val="top"/>
           </w:tcPr>
           <w:p>
@@ -5570,7 +5628,7 @@
         </w:tc>
         <w:tc>
           <w:tcPr>
-            <w:tcW w:w="1681" w:type="dxa"/>
+            <w:tcW w:w="1680" w:type="dxa"/>
             <w:vAlign w:val="top"/>
           </w:tcPr>
           <w:p>
@@ -5623,7 +5681,7 @@
         </w:tc>
         <w:tc>
           <w:tcPr>
-            <w:tcW w:w="2083" w:type="dxa"/>
+            <w:tcW w:w="2084" w:type="dxa"/>
             <w:shd w:val="clear" w:color="auto" w:fill="F4F7FB"/>
             <w:vAlign w:val="top"/>
           </w:tcPr>
@@ -5655,7 +5713,7 @@
         </w:tc>
         <w:tc>
           <w:tcPr>
-            <w:tcW w:w="1681" w:type="dxa"/>
+            <w:tcW w:w="1680" w:type="dxa"/>
             <w:shd w:val="clear" w:color="auto" w:fill="F4F7FB"/>
             <w:vAlign w:val="top"/>
           </w:tcPr>
@@ -5707,7 +5765,7 @@
         </w:tc>
         <w:tc>
           <w:tcPr>
-            <w:tcW w:w="2083" w:type="dxa"/>
+            <w:tcW w:w="2084" w:type="dxa"/>
             <w:vAlign w:val="top"/>
           </w:tcPr>
           <w:p>
@@ -5737,7 +5795,7 @@
         </w:tc>
         <w:tc>
           <w:tcPr>
-            <w:tcW w:w="1681" w:type="dxa"/>
+            <w:tcW w:w="1680" w:type="dxa"/>
             <w:vAlign w:val="top"/>
           </w:tcPr>
           <w:p>
@@ -5790,7 +5848,7 @@
         </w:tc>
         <w:tc>
           <w:tcPr>
-            <w:tcW w:w="2083" w:type="dxa"/>
+            <w:tcW w:w="2084" w:type="dxa"/>
             <w:shd w:val="clear" w:color="auto" w:fill="F4F7FB"/>
             <w:vAlign w:val="top"/>
           </w:tcPr>
@@ -5822,7 +5880,7 @@
         </w:tc>
         <w:tc>
           <w:tcPr>
-            <w:tcW w:w="1681" w:type="dxa"/>
+            <w:tcW w:w="1680" w:type="dxa"/>
             <w:shd w:val="clear" w:color="auto" w:fill="F4F7FB"/>
             <w:vAlign w:val="top"/>
           </w:tcPr>
@@ -5874,7 +5932,7 @@
         </w:tc>
         <w:tc>
           <w:tcPr>
-            <w:tcW w:w="2083" w:type="dxa"/>
+            <w:tcW w:w="2084" w:type="dxa"/>
             <w:vAlign w:val="top"/>
           </w:tcPr>
           <w:p>
@@ -5904,7 +5962,7 @@
         </w:tc>
         <w:tc>
           <w:tcPr>
-            <w:tcW w:w="1681" w:type="dxa"/>
+            <w:tcW w:w="1680" w:type="dxa"/>
             <w:vAlign w:val="top"/>
           </w:tcPr>
           <w:p>
@@ -5954,9 +6012,9 @@
       <w:tblGrid>
         <w:gridCol w:w="1421"/>
         <w:gridCol w:w="1926"/>
-        <w:gridCol w:w="2083"/>
+        <w:gridCol w:w="2084"/>
         <w:gridCol w:w="1916"/>
-        <w:gridCol w:w="1681"/>
+        <w:gridCol w:w="1680"/>
       </w:tblGrid>
       <w:tr>
         <w:trPr>
@@ -6003,7 +6061,7 @@
         </w:tc>
         <w:tc>
           <w:tcPr>
-            <w:tcW w:w="2083" w:type="dxa"/>
+            <w:tcW w:w="2084" w:type="dxa"/>
             <w:shd w:val="clear" w:color="auto" w:fill="0F4761"/>
             <w:vAlign w:val="center"/>
           </w:tcPr>
@@ -6041,7 +6099,7 @@
         </w:tc>
         <w:tc>
           <w:tcPr>
-            <w:tcW w:w="1681" w:type="dxa"/>
+            <w:tcW w:w="1680" w:type="dxa"/>
             <w:shd w:val="clear" w:color="auto" w:fill="0F4761"/>
             <w:vAlign w:val="center"/>
           </w:tcPr>
@@ -6096,7 +6154,7 @@
         </w:tc>
         <w:tc>
           <w:tcPr>
-            <w:tcW w:w="2083" w:type="dxa"/>
+            <w:tcW w:w="2084" w:type="dxa"/>
             <w:vAlign w:val="top"/>
           </w:tcPr>
           <w:p>
@@ -6126,7 +6184,7 @@
         </w:tc>
         <w:tc>
           <w:tcPr>
-            <w:tcW w:w="1681" w:type="dxa"/>
+            <w:tcW w:w="1680" w:type="dxa"/>
             <w:vAlign w:val="top"/>
           </w:tcPr>
           <w:p>
@@ -6179,7 +6237,7 @@
         </w:tc>
         <w:tc>
           <w:tcPr>
-            <w:tcW w:w="2083" w:type="dxa"/>
+            <w:tcW w:w="2084" w:type="dxa"/>
             <w:shd w:val="clear" w:color="auto" w:fill="F4F7FB"/>
             <w:vAlign w:val="top"/>
           </w:tcPr>
@@ -6211,7 +6269,7 @@
         </w:tc>
         <w:tc>
           <w:tcPr>
-            <w:tcW w:w="1681" w:type="dxa"/>
+            <w:tcW w:w="1680" w:type="dxa"/>
             <w:shd w:val="clear" w:color="auto" w:fill="F4F7FB"/>
             <w:vAlign w:val="top"/>
           </w:tcPr>
@@ -6263,7 +6321,7 @@
         </w:tc>
         <w:tc>
           <w:tcPr>
-            <w:tcW w:w="2083" w:type="dxa"/>
+            <w:tcW w:w="2084" w:type="dxa"/>
             <w:vAlign w:val="top"/>
           </w:tcPr>
           <w:p>
@@ -6293,7 +6351,7 @@
         </w:tc>
         <w:tc>
           <w:tcPr>
-            <w:tcW w:w="1681" w:type="dxa"/>
+            <w:tcW w:w="1680" w:type="dxa"/>
             <w:vAlign w:val="top"/>
           </w:tcPr>
           <w:p>
@@ -6346,7 +6404,7 @@
         </w:tc>
         <w:tc>
           <w:tcPr>
-            <w:tcW w:w="2083" w:type="dxa"/>
+            <w:tcW w:w="2084" w:type="dxa"/>
             <w:shd w:val="clear" w:color="auto" w:fill="F4F7FB"/>
             <w:vAlign w:val="top"/>
           </w:tcPr>
@@ -6378,7 +6436,7 @@
         </w:tc>
         <w:tc>
           <w:tcPr>
-            <w:tcW w:w="1681" w:type="dxa"/>
+            <w:tcW w:w="1680" w:type="dxa"/>
             <w:shd w:val="clear" w:color="auto" w:fill="F4F7FB"/>
             <w:vAlign w:val="top"/>
           </w:tcPr>
@@ -6429,9 +6487,9 @@
       <w:tblGrid>
         <w:gridCol w:w="1421"/>
         <w:gridCol w:w="1926"/>
-        <w:gridCol w:w="2083"/>
+        <w:gridCol w:w="2084"/>
         <w:gridCol w:w="1916"/>
-        <w:gridCol w:w="1681"/>
+        <w:gridCol w:w="1680"/>
       </w:tblGrid>
       <w:tr>
         <w:trPr>
@@ -6478,7 +6536,7 @@
         </w:tc>
         <w:tc>
           <w:tcPr>
-            <w:tcW w:w="2083" w:type="dxa"/>
+            <w:tcW w:w="2084" w:type="dxa"/>
             <w:shd w:val="clear" w:color="auto" w:fill="0F4761"/>
             <w:vAlign w:val="center"/>
           </w:tcPr>
@@ -6516,7 +6574,7 @@
         </w:tc>
         <w:tc>
           <w:tcPr>
-            <w:tcW w:w="1681" w:type="dxa"/>
+            <w:tcW w:w="1680" w:type="dxa"/>
             <w:shd w:val="clear" w:color="auto" w:fill="0F4761"/>
             <w:vAlign w:val="center"/>
           </w:tcPr>
@@ -6571,7 +6629,7 @@
         </w:tc>
         <w:tc>
           <w:tcPr>
-            <w:tcW w:w="2083" w:type="dxa"/>
+            <w:tcW w:w="2084" w:type="dxa"/>
             <w:vAlign w:val="top"/>
           </w:tcPr>
           <w:p>
@@ -6601,7 +6659,7 @@
         </w:tc>
         <w:tc>
           <w:tcPr>
-            <w:tcW w:w="1681" w:type="dxa"/>
+            <w:tcW w:w="1680" w:type="dxa"/>
             <w:vAlign w:val="top"/>
           </w:tcPr>
           <w:p>
@@ -6654,7 +6712,7 @@
         </w:tc>
         <w:tc>
           <w:tcPr>
-            <w:tcW w:w="2083" w:type="dxa"/>
+            <w:tcW w:w="2084" w:type="dxa"/>
             <w:shd w:val="clear" w:color="auto" w:fill="F4F7FB"/>
             <w:vAlign w:val="top"/>
           </w:tcPr>
@@ -6686,7 +6744,7 @@
         </w:tc>
         <w:tc>
           <w:tcPr>
-            <w:tcW w:w="1681" w:type="dxa"/>
+            <w:tcW w:w="1680" w:type="dxa"/>
             <w:shd w:val="clear" w:color="auto" w:fill="F4F7FB"/>
             <w:vAlign w:val="top"/>
           </w:tcPr>
@@ -6738,7 +6796,7 @@
         </w:tc>
         <w:tc>
           <w:tcPr>
-            <w:tcW w:w="2083" w:type="dxa"/>
+            <w:tcW w:w="2084" w:type="dxa"/>
             <w:vAlign w:val="top"/>
           </w:tcPr>
           <w:p>
@@ -6768,7 +6826,7 @@
         </w:tc>
         <w:tc>
           <w:tcPr>
-            <w:tcW w:w="1681" w:type="dxa"/>
+            <w:tcW w:w="1680" w:type="dxa"/>
             <w:vAlign w:val="top"/>
           </w:tcPr>
           <w:p>
@@ -6821,7 +6879,7 @@
         </w:tc>
         <w:tc>
           <w:tcPr>
-            <w:tcW w:w="2083" w:type="dxa"/>
+            <w:tcW w:w="2084" w:type="dxa"/>
             <w:shd w:val="clear" w:color="auto" w:fill="F4F7FB"/>
             <w:vAlign w:val="top"/>
           </w:tcPr>
@@ -6853,7 +6911,7 @@
         </w:tc>
         <w:tc>
           <w:tcPr>
-            <w:tcW w:w="1681" w:type="dxa"/>
+            <w:tcW w:w="1680" w:type="dxa"/>
             <w:shd w:val="clear" w:color="auto" w:fill="F4F7FB"/>
             <w:vAlign w:val="top"/>
           </w:tcPr>
@@ -6905,7 +6963,7 @@
         </w:tc>
         <w:tc>
           <w:tcPr>
-            <w:tcW w:w="2083" w:type="dxa"/>
+            <w:tcW w:w="2084" w:type="dxa"/>
             <w:vAlign w:val="top"/>
           </w:tcPr>
           <w:p>
@@ -6935,7 +6993,7 @@
         </w:tc>
         <w:tc>
           <w:tcPr>
-            <w:tcW w:w="1681" w:type="dxa"/>
+            <w:tcW w:w="1680" w:type="dxa"/>
             <w:vAlign w:val="top"/>
           </w:tcPr>
           <w:p>
@@ -6988,7 +7046,7 @@
         </w:tc>
         <w:tc>
           <w:tcPr>
-            <w:tcW w:w="2083" w:type="dxa"/>
+            <w:tcW w:w="2084" w:type="dxa"/>
             <w:shd w:val="clear" w:color="auto" w:fill="F4F7FB"/>
             <w:vAlign w:val="top"/>
           </w:tcPr>
@@ -7020,7 +7078,7 @@
         </w:tc>
         <w:tc>
           <w:tcPr>
-            <w:tcW w:w="1681" w:type="dxa"/>
+            <w:tcW w:w="1680" w:type="dxa"/>
             <w:shd w:val="clear" w:color="auto" w:fill="F4F7FB"/>
             <w:vAlign w:val="top"/>
           </w:tcPr>
@@ -7071,9 +7129,9 @@
       <w:tblGrid>
         <w:gridCol w:w="1421"/>
         <w:gridCol w:w="1926"/>
-        <w:gridCol w:w="2083"/>
+        <w:gridCol w:w="2084"/>
         <w:gridCol w:w="1916"/>
-        <w:gridCol w:w="1681"/>
+        <w:gridCol w:w="1680"/>
       </w:tblGrid>
       <w:tr>
         <w:trPr>
@@ -7120,7 +7178,7 @@
         </w:tc>
         <w:tc>
           <w:tcPr>
-            <w:tcW w:w="2083" w:type="dxa"/>
+            <w:tcW w:w="2084" w:type="dxa"/>
             <w:shd w:val="clear" w:color="auto" w:fill="0F4761"/>
             <w:vAlign w:val="center"/>
           </w:tcPr>
@@ -7158,7 +7216,7 @@
         </w:tc>
         <w:tc>
           <w:tcPr>
-            <w:tcW w:w="1681" w:type="dxa"/>
+            <w:tcW w:w="1680" w:type="dxa"/>
             <w:shd w:val="clear" w:color="auto" w:fill="0F4761"/>
             <w:vAlign w:val="center"/>
           </w:tcPr>
@@ -7213,7 +7271,7 @@
         </w:tc>
         <w:tc>
           <w:tcPr>
-            <w:tcW w:w="2083" w:type="dxa"/>
+            <w:tcW w:w="2084" w:type="dxa"/>
             <w:vAlign w:val="top"/>
           </w:tcPr>
           <w:p>
@@ -7243,7 +7301,7 @@
         </w:tc>
         <w:tc>
           <w:tcPr>
-            <w:tcW w:w="1681" w:type="dxa"/>
+            <w:tcW w:w="1680" w:type="dxa"/>
             <w:vAlign w:val="top"/>
           </w:tcPr>
           <w:p>
@@ -7296,7 +7354,7 @@
         </w:tc>
         <w:tc>
           <w:tcPr>
-            <w:tcW w:w="2083" w:type="dxa"/>
+            <w:tcW w:w="2084" w:type="dxa"/>
             <w:shd w:val="clear" w:color="auto" w:fill="F4F7FB"/>
             <w:vAlign w:val="top"/>
           </w:tcPr>
@@ -7328,7 +7386,7 @@
         </w:tc>
         <w:tc>
           <w:tcPr>
-            <w:tcW w:w="1681" w:type="dxa"/>
+            <w:tcW w:w="1680" w:type="dxa"/>
             <w:shd w:val="clear" w:color="auto" w:fill="F4F7FB"/>
             <w:vAlign w:val="top"/>
           </w:tcPr>
@@ -7380,7 +7438,7 @@
         </w:tc>
         <w:tc>
           <w:tcPr>
-            <w:tcW w:w="2083" w:type="dxa"/>
+            <w:tcW w:w="2084" w:type="dxa"/>
             <w:vAlign w:val="top"/>
           </w:tcPr>
           <w:p>
@@ -7410,7 +7468,7 @@
         </w:tc>
         <w:tc>
           <w:tcPr>
-            <w:tcW w:w="1681" w:type="dxa"/>
+            <w:tcW w:w="1680" w:type="dxa"/>
             <w:vAlign w:val="top"/>
           </w:tcPr>
           <w:p>
@@ -7463,7 +7521,7 @@
         </w:tc>
         <w:tc>
           <w:tcPr>
-            <w:tcW w:w="2083" w:type="dxa"/>
+            <w:tcW w:w="2084" w:type="dxa"/>
             <w:shd w:val="clear" w:color="auto" w:fill="F4F7FB"/>
             <w:vAlign w:val="top"/>
           </w:tcPr>
@@ -7495,7 +7553,7 @@
         </w:tc>
         <w:tc>
           <w:tcPr>
-            <w:tcW w:w="1681" w:type="dxa"/>
+            <w:tcW w:w="1680" w:type="dxa"/>
             <w:shd w:val="clear" w:color="auto" w:fill="F4F7FB"/>
             <w:vAlign w:val="top"/>
           </w:tcPr>
@@ -7547,7 +7605,7 @@
         </w:tc>
         <w:tc>
           <w:tcPr>
-            <w:tcW w:w="2083" w:type="dxa"/>
+            <w:tcW w:w="2084" w:type="dxa"/>
             <w:vAlign w:val="top"/>
           </w:tcPr>
           <w:p>
@@ -7577,7 +7635,7 @@
         </w:tc>
         <w:tc>
           <w:tcPr>
-            <w:tcW w:w="1681" w:type="dxa"/>
+            <w:tcW w:w="1680" w:type="dxa"/>
             <w:vAlign w:val="top"/>
           </w:tcPr>
           <w:p>
@@ -7630,7 +7688,7 @@
         </w:tc>
         <w:tc>
           <w:tcPr>
-            <w:tcW w:w="2083" w:type="dxa"/>
+            <w:tcW w:w="2084" w:type="dxa"/>
             <w:shd w:val="clear" w:color="auto" w:fill="F4F7FB"/>
             <w:vAlign w:val="top"/>
           </w:tcPr>
@@ -7662,7 +7720,7 @@
         </w:tc>
         <w:tc>
           <w:tcPr>
-            <w:tcW w:w="1681" w:type="dxa"/>
+            <w:tcW w:w="1680" w:type="dxa"/>
             <w:shd w:val="clear" w:color="auto" w:fill="F4F7FB"/>
             <w:vAlign w:val="top"/>
           </w:tcPr>
@@ -7713,9 +7771,9 @@
       <w:tblGrid>
         <w:gridCol w:w="1421"/>
         <w:gridCol w:w="1926"/>
-        <w:gridCol w:w="2083"/>
+        <w:gridCol w:w="2084"/>
         <w:gridCol w:w="1916"/>
-        <w:gridCol w:w="1681"/>
+        <w:gridCol w:w="1680"/>
       </w:tblGrid>
       <w:tr>
         <w:trPr>
@@ -7762,7 +7820,7 @@
         </w:tc>
         <w:tc>
           <w:tcPr>
-            <w:tcW w:w="2083" w:type="dxa"/>
+            <w:tcW w:w="2084" w:type="dxa"/>
             <w:shd w:val="clear" w:color="auto" w:fill="0F4761"/>
             <w:vAlign w:val="center"/>
           </w:tcPr>
@@ -7800,7 +7858,7 @@
         </w:tc>
         <w:tc>
           <w:tcPr>
-            <w:tcW w:w="1681" w:type="dxa"/>
+            <w:tcW w:w="1680" w:type="dxa"/>
             <w:shd w:val="clear" w:color="auto" w:fill="0F4761"/>
             <w:vAlign w:val="center"/>
           </w:tcPr>
@@ -7855,7 +7913,7 @@
         </w:tc>
         <w:tc>
           <w:tcPr>
-            <w:tcW w:w="2083" w:type="dxa"/>
+            <w:tcW w:w="2084" w:type="dxa"/>
             <w:vAlign w:val="top"/>
           </w:tcPr>
           <w:p>
@@ -7885,7 +7943,7 @@
         </w:tc>
         <w:tc>
           <w:tcPr>
-            <w:tcW w:w="1681" w:type="dxa"/>
+            <w:tcW w:w="1680" w:type="dxa"/>
             <w:vAlign w:val="top"/>
           </w:tcPr>
           <w:p>
@@ -7938,7 +7996,7 @@
         </w:tc>
         <w:tc>
           <w:tcPr>
-            <w:tcW w:w="2083" w:type="dxa"/>
+            <w:tcW w:w="2084" w:type="dxa"/>
             <w:shd w:val="clear" w:color="auto" w:fill="F4F7FB"/>
             <w:vAlign w:val="top"/>
           </w:tcPr>
@@ -7970,7 +8028,7 @@
         </w:tc>
         <w:tc>
           <w:tcPr>
-            <w:tcW w:w="1681" w:type="dxa"/>
+            <w:tcW w:w="1680" w:type="dxa"/>
             <w:shd w:val="clear" w:color="auto" w:fill="F4F7FB"/>
             <w:vAlign w:val="top"/>
           </w:tcPr>
@@ -8022,7 +8080,7 @@
         </w:tc>
         <w:tc>
           <w:tcPr>
-            <w:tcW w:w="2083" w:type="dxa"/>
+            <w:tcW w:w="2084" w:type="dxa"/>
             <w:vAlign w:val="top"/>
           </w:tcPr>
           <w:p>
@@ -8052,7 +8110,7 @@
         </w:tc>
         <w:tc>
           <w:tcPr>
-            <w:tcW w:w="1681" w:type="dxa"/>
+            <w:tcW w:w="1680" w:type="dxa"/>
             <w:vAlign w:val="top"/>
           </w:tcPr>
           <w:p>
@@ -8105,7 +8163,7 @@
         </w:tc>
         <w:tc>
           <w:tcPr>
-            <w:tcW w:w="2083" w:type="dxa"/>
+            <w:tcW w:w="2084" w:type="dxa"/>
             <w:shd w:val="clear" w:color="auto" w:fill="F4F7FB"/>
             <w:vAlign w:val="top"/>
           </w:tcPr>
@@ -8137,7 +8195,7 @@
         </w:tc>
         <w:tc>
           <w:tcPr>
-            <w:tcW w:w="1681" w:type="dxa"/>
+            <w:tcW w:w="1680" w:type="dxa"/>
             <w:shd w:val="clear" w:color="auto" w:fill="F4F7FB"/>
             <w:vAlign w:val="top"/>
           </w:tcPr>
@@ -8188,9 +8246,9 @@
       <w:tblGrid>
         <w:gridCol w:w="1421"/>
         <w:gridCol w:w="1926"/>
-        <w:gridCol w:w="2083"/>
+        <w:gridCol w:w="2084"/>
         <w:gridCol w:w="1916"/>
-        <w:gridCol w:w="1681"/>
+        <w:gridCol w:w="1680"/>
       </w:tblGrid>
       <w:tr>
         <w:trPr>
@@ -8237,7 +8295,7 @@
         </w:tc>
         <w:tc>
           <w:tcPr>
-            <w:tcW w:w="2083" w:type="dxa"/>
+            <w:tcW w:w="2084" w:type="dxa"/>
             <w:shd w:val="clear" w:color="auto" w:fill="0F4761"/>
             <w:vAlign w:val="center"/>
           </w:tcPr>
@@ -8275,7 +8333,7 @@
         </w:tc>
         <w:tc>
           <w:tcPr>
-            <w:tcW w:w="1681" w:type="dxa"/>
+            <w:tcW w:w="1680" w:type="dxa"/>
             <w:shd w:val="clear" w:color="auto" w:fill="0F4761"/>
             <w:vAlign w:val="center"/>
           </w:tcPr>
@@ -8330,7 +8388,7 @@
         </w:tc>
         <w:tc>
           <w:tcPr>
-            <w:tcW w:w="2083" w:type="dxa"/>
+            <w:tcW w:w="2084" w:type="dxa"/>
             <w:vAlign w:val="top"/>
           </w:tcPr>
           <w:p>
@@ -8360,7 +8418,7 @@
         </w:tc>
         <w:tc>
           <w:tcPr>
-            <w:tcW w:w="1681" w:type="dxa"/>
+            <w:tcW w:w="1680" w:type="dxa"/>
             <w:vAlign w:val="top"/>
           </w:tcPr>
           <w:p>
@@ -8413,7 +8471,7 @@
         </w:tc>
         <w:tc>
           <w:tcPr>
-            <w:tcW w:w="2083" w:type="dxa"/>
+            <w:tcW w:w="2084" w:type="dxa"/>
             <w:shd w:val="clear" w:color="auto" w:fill="F4F7FB"/>
             <w:vAlign w:val="top"/>
           </w:tcPr>
@@ -8423,7 +8481,7 @@
               <w:jc w:val="left"/>
             </w:pPr>
             <w:r>
-              <w:t xml:space="preserve">How customers use the app in the VETC app</w:t>
+              <w:t xml:space="preserve">How customers use the customer app, starting in the VETC app</w:t>
             </w:r>
           </w:p>
         </w:tc>
@@ -8445,7 +8503,7 @@
         </w:tc>
         <w:tc>
           <w:tcPr>
-            <w:tcW w:w="1681" w:type="dxa"/>
+            <w:tcW w:w="1680" w:type="dxa"/>
             <w:shd w:val="clear" w:color="auto" w:fill="F4F7FB"/>
             <w:vAlign w:val="top"/>
           </w:tcPr>
@@ -8497,7 +8555,7 @@
         </w:tc>
         <w:tc>
           <w:tcPr>
-            <w:tcW w:w="2083" w:type="dxa"/>
+            <w:tcW w:w="2084" w:type="dxa"/>
             <w:vAlign w:val="top"/>
           </w:tcPr>
           <w:p>
@@ -8527,7 +8585,7 @@
         </w:tc>
         <w:tc>
           <w:tcPr>
-            <w:tcW w:w="1681" w:type="dxa"/>
+            <w:tcW w:w="1680" w:type="dxa"/>
             <w:vAlign w:val="top"/>
           </w:tcPr>
           <w:p>

</xml_diff>